<commit_message>
docs: 调整 CMD 32/33 章节顺序到 CMD 31 之后
原 python-docx 追加导致 32/33 在文档末尾, 现移到 CMD 31 和 CMD 100
之间, 顺序为 CMD 30/31/32/33/100。
</commit_message>
<xml_diff>
--- a/DOC/操作说明_PLC命令_v4.bak.docx
+++ b/DOC/操作说明_PLC命令_v4.bak.docx
@@ -28945,6 +28945,1088 @@
         </w:tc>
       </w:tr>
     </w:tbl>
+    <w:sectPr>
+      <w:pgSz w:w="12240" w:h="15840"/>
+      <w:pgMar w:top="1440" w:right="1800" w:bottom="1440" w:left="1800" w:header="720" w:footer="720" w:gutter="0"/>
+      <w:cols w:space="720" w:num="1"/>
+      <w:docGrid w:linePitch="360" w:charSpace="0"/>
+    </w:sectPr>
+    <w:tbl>
+      <w:tblPr>
+        <w:tblStyle w:val="33"/>
+        <w:tblW w:type="auto" w:w="0"/>
+        <w:tblLook w:firstColumn="1" w:firstRow="1" w:lastColumn="0" w:lastRow="0" w:noHBand="0" w:noVBand="1" w:val="04A0"/>
+      </w:tblPr>
+      <w:tblGrid>
+        <w:gridCol w:w="2160"/>
+        <w:gridCol w:w="2160"/>
+        <w:gridCol w:w="2160"/>
+        <w:gridCol w:w="2160"/>
+      </w:tblGrid>
+      <w:tr>
+        <w:tc>
+          <w:tcPr>
+            <w:tcW w:type="dxa" w:w="2160"/>
+          </w:tcPr>
+          <w:p>
+            <w:r>
+              <w:t>步骤</w:t>
+            </w:r>
+          </w:p>
+        </w:tc>
+        <w:tc>
+          <w:tcPr>
+            <w:tcW w:type="dxa" w:w="2160"/>
+          </w:tcPr>
+          <w:p>
+            <w:r>
+              <w:t>变量</w:t>
+            </w:r>
+          </w:p>
+        </w:tc>
+        <w:tc>
+          <w:tcPr>
+            <w:tcW w:type="dxa" w:w="2160"/>
+          </w:tcPr>
+          <w:p>
+            <w:r>
+              <w:t>值</w:t>
+            </w:r>
+          </w:p>
+        </w:tc>
+        <w:tc>
+          <w:tcPr>
+            <w:tcW w:type="dxa" w:w="2160"/>
+          </w:tcPr>
+          <w:p>
+            <w:r>
+              <w:t>说明</w:t>
+            </w:r>
+          </w:p>
+        </w:tc>
+      </w:tr>
+      <w:tr>
+        <w:tc>
+          <w:tcPr>
+            <w:tcW w:type="dxa" w:w="2160"/>
+          </w:tcPr>
+          <w:p>
+            <w:r>
+              <w:t>①</w:t>
+            </w:r>
+          </w:p>
+        </w:tc>
+        <w:tc>
+          <w:tcPr>
+            <w:tcW w:type="dxa" w:w="2160"/>
+          </w:tcPr>
+          <w:p>
+            <w:r>
+              <w:t>CMD</w:t>
+            </w:r>
+          </w:p>
+        </w:tc>
+        <w:tc>
+          <w:tcPr>
+            <w:tcW w:type="dxa" w:w="2160"/>
+          </w:tcPr>
+          <w:p>
+            <w:r>
+              <w:t>0</w:t>
+            </w:r>
+          </w:p>
+        </w:tc>
+        <w:tc>
+          <w:tcPr>
+            <w:tcW w:type="dxa" w:w="2160"/>
+          </w:tcPr>
+          <w:p>
+            <w:r>
+              <w:t>复位命令</w:t>
+            </w:r>
+          </w:p>
+        </w:tc>
+      </w:tr>
+      <w:tr>
+        <w:tc>
+          <w:tcPr>
+            <w:tcW w:type="dxa" w:w="2160"/>
+          </w:tcPr>
+          <w:p>
+            <w:r>
+              <w:t>②</w:t>
+            </w:r>
+          </w:p>
+        </w:tc>
+        <w:tc>
+          <w:tcPr>
+            <w:tcW w:type="dxa" w:w="2160"/>
+          </w:tcPr>
+          <w:p>
+            <w:r>
+              <w:t>ADDR</w:t>
+            </w:r>
+          </w:p>
+        </w:tc>
+        <w:tc>
+          <w:tcPr>
+            <w:tcW w:type="dxa" w:w="2160"/>
+          </w:tcPr>
+          <w:p>
+            <w:r>
+              <w:t>0</w:t>
+            </w:r>
+          </w:p>
+        </w:tc>
+        <w:tc>
+          <w:tcPr>
+            <w:tcW w:type="dxa" w:w="2160"/>
+          </w:tcPr>
+          <w:p>
+            <w:r>
+              <w:t>USER 起始地址 0</w:t>
+            </w:r>
+          </w:p>
+        </w:tc>
+      </w:tr>
+      <w:tr>
+        <w:tc>
+          <w:tcPr>
+            <w:tcW w:type="dxa" w:w="2160"/>
+          </w:tcPr>
+          <w:p>
+            <w:r>
+              <w:t>②</w:t>
+            </w:r>
+          </w:p>
+        </w:tc>
+        <w:tc>
+          <w:tcPr>
+            <w:tcW w:type="dxa" w:w="2160"/>
+          </w:tcPr>
+          <w:p>
+            <w:r>
+              <w:t>WORDS</w:t>
+            </w:r>
+          </w:p>
+        </w:tc>
+        <w:tc>
+          <w:tcPr>
+            <w:tcW w:type="dxa" w:w="2160"/>
+          </w:tcPr>
+          <w:p>
+            <w:r>
+              <w:t>8</w:t>
+            </w:r>
+          </w:p>
+        </w:tc>
+        <w:tc>
+          <w:tcPr>
+            <w:tcW w:type="dxa" w:w="2160"/>
+          </w:tcPr>
+          <w:p>
+            <w:r>
+              <w:t>每通道读 USER 8 字</w:t>
+            </w:r>
+          </w:p>
+        </w:tc>
+      </w:tr>
+      <w:tr>
+        <w:tc>
+          <w:tcPr>
+            <w:tcW w:type="dxa" w:w="2160"/>
+          </w:tcPr>
+          <w:p>
+            <w:r>
+              <w:t>③</w:t>
+            </w:r>
+          </w:p>
+        </w:tc>
+        <w:tc>
+          <w:tcPr>
+            <w:tcW w:type="dxa" w:w="2160"/>
+          </w:tcPr>
+          <w:p>
+            <w:r>
+              <w:t>CMD</w:t>
+            </w:r>
+          </w:p>
+        </w:tc>
+        <w:tc>
+          <w:tcPr>
+            <w:tcW w:type="dxa" w:w="2160"/>
+          </w:tcPr>
+          <w:p>
+            <w:r>
+              <w:t>33</w:t>
+            </w:r>
+          </w:p>
+        </w:tc>
+        <w:tc>
+          <w:tcPr>
+            <w:tcW w:type="dxa" w:w="2160"/>
+          </w:tcPr>
+          <w:p>
+            <w:r>
+              <w:t>触发命令</w:t>
+            </w:r>
+          </w:p>
+        </w:tc>
+      </w:tr>
+      <w:tr>
+        <w:tc>
+          <w:tcPr>
+            <w:tcW w:type="dxa" w:w="2160"/>
+          </w:tcPr>
+          <w:p>
+            <w:r>
+              <w:t>④</w:t>
+            </w:r>
+          </w:p>
+        </w:tc>
+        <w:tc>
+          <w:tcPr>
+            <w:tcW w:type="dxa" w:w="2160"/>
+          </w:tcPr>
+          <w:p>
+            <w:r>
+              <w:t>等待</w:t>
+            </w:r>
+          </w:p>
+        </w:tc>
+        <w:tc>
+          <w:tcPr>
+            <w:tcW w:type="dxa" w:w="2160"/>
+          </w:tcPr>
+          <w:p>
+            <w:r>
+              <w:t>—</w:t>
+            </w:r>
+          </w:p>
+        </w:tc>
+        <w:tc>
+          <w:tcPr>
+            <w:tcW w:type="dxa" w:w="2160"/>
+          </w:tcPr>
+          <w:p>
+            <w:r>
+              <w:t>CMD_STATUS=2（约 300~600ms）</w:t>
+            </w:r>
+          </w:p>
+        </w:tc>
+      </w:tr>
+      <w:tr>
+        <w:tc>
+          <w:tcPr>
+            <w:tcW w:type="dxa" w:w="2160"/>
+          </w:tcPr>
+          <w:p>
+            <w:r>
+              <w:t>⑤</w:t>
+            </w:r>
+          </w:p>
+        </w:tc>
+        <w:tc>
+          <w:tcPr>
+            <w:tcW w:type="dxa" w:w="2160"/>
+          </w:tcPr>
+          <w:p>
+            <w:r>
+              <w:t>RETURN_DATA_LEN</w:t>
+            </w:r>
+          </w:p>
+        </w:tc>
+        <w:tc>
+          <w:tcPr>
+            <w:tcW w:type="dxa" w:w="2160"/>
+          </w:tcPr>
+          <w:p>
+            <w:r>
+              <w:t>108</w:t>
+            </w:r>
+          </w:p>
+        </w:tc>
+        <w:tc>
+          <w:tcPr>
+            <w:tcW w:type="dxa" w:w="2160"/>
+          </w:tcPr>
+          <w:p>
+            <w:r>
+              <w:t>3 通道 × 18 字 × 2 字节</w:t>
+            </w:r>
+          </w:p>
+        </w:tc>
+      </w:tr>
+      <w:tr>
+        <w:tc>
+          <w:tcPr>
+            <w:tcW w:type="dxa" w:w="2160"/>
+          </w:tcPr>
+          <w:p>
+            <w:r>
+              <w:t>⑤</w:t>
+            </w:r>
+          </w:p>
+        </w:tc>
+        <w:tc>
+          <w:tcPr>
+            <w:tcW w:type="dxa" w:w="2160"/>
+          </w:tcPr>
+          <w:p>
+            <w:r>
+              <w:t>RETURN_DATA1..54</w:t>
+            </w:r>
+          </w:p>
+        </w:tc>
+        <w:tc>
+          <w:tcPr>
+            <w:tcW w:type="dxa" w:w="2160"/>
+          </w:tcPr>
+          <w:p>
+            <w:r>
+              <w:t>—</w:t>
+            </w:r>
+          </w:p>
+        </w:tc>
+        <w:tc>
+          <w:tcPr>
+            <w:tcW w:type="dxa" w:w="2160"/>
+          </w:tcPr>
+          <w:p>
+            <w:r>
+              <w:t>三通道 EPC+USER 数据</w:t>
+            </w:r>
+          </w:p>
+        </w:tc>
+      </w:tr>
+      <w:tr>
+        <w:tc>
+          <w:tcPr>
+            <w:tcW w:type="dxa" w:w="2160"/>
+          </w:tcPr>
+          <w:p>
+            <w:r>
+              <w:t>⑥</w:t>
+            </w:r>
+          </w:p>
+        </w:tc>
+        <w:tc>
+          <w:tcPr>
+            <w:tcW w:type="dxa" w:w="2160"/>
+          </w:tcPr>
+          <w:p>
+            <w:r>
+              <w:t>CMD</w:t>
+            </w:r>
+          </w:p>
+        </w:tc>
+        <w:tc>
+          <w:tcPr>
+            <w:tcW w:type="dxa" w:w="2160"/>
+          </w:tcPr>
+          <w:p>
+            <w:r>
+              <w:t>0</w:t>
+            </w:r>
+          </w:p>
+        </w:tc>
+        <w:tc>
+          <w:tcPr>
+            <w:tcW w:type="dxa" w:w="2160"/>
+          </w:tcPr>
+          <w:p>
+            <w:r>
+              <w:t>复位命令</w:t>
+            </w:r>
+          </w:p>
+        </w:tc>
+      </w:tr>
+    </w:tbl>
+    <w:p>
+      <w:pPr>
+        <w:pStyle w:val="5"/>
+      </w:pPr>
+      <w:r>
+        <w:t>案例：读三通道 EPC+USER 8 字</w:t>
+      </w:r>
+    </w:p>
+    <w:tbl>
+      <w:tblPr>
+        <w:tblStyle w:val="33"/>
+        <w:tblW w:type="auto" w:w="0"/>
+        <w:tblLook w:firstColumn="1" w:firstRow="1" w:lastColumn="0" w:lastRow="0" w:noHBand="0" w:noVBand="1" w:val="04A0"/>
+      </w:tblPr>
+      <w:tblGrid>
+        <w:gridCol w:w="2880"/>
+        <w:gridCol w:w="2880"/>
+        <w:gridCol w:w="2880"/>
+      </w:tblGrid>
+      <w:tr>
+        <w:tc>
+          <w:tcPr>
+            <w:tcW w:type="dxa" w:w="2880"/>
+          </w:tcPr>
+          <w:p>
+            <w:r>
+              <w:t>通道</w:t>
+            </w:r>
+          </w:p>
+        </w:tc>
+        <w:tc>
+          <w:tcPr>
+            <w:tcW w:type="dxa" w:w="2880"/>
+          </w:tcPr>
+          <w:p>
+            <w:r>
+              <w:t>EPC</w:t>
+            </w:r>
+          </w:p>
+        </w:tc>
+        <w:tc>
+          <w:tcPr>
+            <w:tcW w:type="dxa" w:w="2880"/>
+          </w:tcPr>
+          <w:p>
+            <w:r>
+              <w:t>USER</w:t>
+            </w:r>
+          </w:p>
+        </w:tc>
+      </w:tr>
+      <w:tr>
+        <w:tc>
+          <w:tcPr>
+            <w:tcW w:type="dxa" w:w="2880"/>
+          </w:tcPr>
+          <w:p>
+            <w:r>
+              <w:t>通道1</w:t>
+            </w:r>
+          </w:p>
+        </w:tc>
+        <w:tc>
+          <w:tcPr>
+            <w:tcW w:type="dxa" w:w="2880"/>
+          </w:tcPr>
+          <w:p>
+            <w:r>
+              <w:t>RETURN_DATA1=状态, RETURN_DATA2~9=EPC</w:t>
+            </w:r>
+          </w:p>
+        </w:tc>
+        <w:tc>
+          <w:tcPr>
+            <w:tcW w:type="dxa" w:w="2880"/>
+          </w:tcPr>
+          <w:p>
+            <w:r>
+              <w:t>RETURN_DATA10=状态, RETURN_DATA11~18=USER</w:t>
+            </w:r>
+          </w:p>
+        </w:tc>
+      </w:tr>
+      <w:tr>
+        <w:tc>
+          <w:tcPr>
+            <w:tcW w:type="dxa" w:w="2880"/>
+          </w:tcPr>
+          <w:p>
+            <w:r>
+              <w:t>通道2</w:t>
+            </w:r>
+          </w:p>
+        </w:tc>
+        <w:tc>
+          <w:tcPr>
+            <w:tcW w:type="dxa" w:w="2880"/>
+          </w:tcPr>
+          <w:p>
+            <w:r>
+              <w:t>RETURN_DATA19=状态, RETURN_DATA20~27=EPC</w:t>
+            </w:r>
+          </w:p>
+        </w:tc>
+        <w:tc>
+          <w:tcPr>
+            <w:tcW w:type="dxa" w:w="2880"/>
+          </w:tcPr>
+          <w:p>
+            <w:r>
+              <w:t>RETURN_DATA28=状态, RETURN_DATA29~36=USER</w:t>
+            </w:r>
+          </w:p>
+        </w:tc>
+      </w:tr>
+      <w:tr>
+        <w:tc>
+          <w:tcPr>
+            <w:tcW w:type="dxa" w:w="2880"/>
+          </w:tcPr>
+          <w:p>
+            <w:r>
+              <w:t>通道3</w:t>
+            </w:r>
+          </w:p>
+        </w:tc>
+        <w:tc>
+          <w:tcPr>
+            <w:tcW w:type="dxa" w:w="2880"/>
+          </w:tcPr>
+          <w:p>
+            <w:r>
+              <w:t>RETURN_DATA37=状态, RETURN_DATA38~45=EPC</w:t>
+            </w:r>
+          </w:p>
+        </w:tc>
+        <w:tc>
+          <w:tcPr>
+            <w:tcW w:type="dxa" w:w="2880"/>
+          </w:tcPr>
+          <w:p>
+            <w:r>
+              <w:t>RETURN_DATA46=状态, RETURN_DATA47~54=USER</w:t>
+            </w:r>
+          </w:p>
+        </w:tc>
+      </w:tr>
+    </w:tbl>
+    <w:p>
+      <w:pPr>
+        <w:pStyle w:val="5"/>
+      </w:pPr>
+      <w:r>
+        <w:t>PLC 解析（WORDS=8 为例，每通道 18 字）：</w:t>
+      </w:r>
+    </w:p>
+    <w:p>
+      <w:pPr/>
+      <w:r>
+        <w:t>• RETURN_DATA_LEN = 3 × (1+8+1+WORDS) × 2 字节</w:t>
+      </w:r>
+    </w:p>
+    <w:p>
+      <w:pPr/>
+      <w:r>
+        <w:t>• 失败通道：状态写错误码，EPC/USER 数据填 0，继续下一通道</w:t>
+      </w:r>
+    </w:p>
+    <w:p>
+      <w:pPr/>
+      <w:r>
+        <w:t>• 每段前 1 字状态：0=成功，非 0=错误码（如 0x15 无标签、0x09 读失败）</w:t>
+      </w:r>
+    </w:p>
+    <w:p>
+      <w:pPr/>
+      <w:r>
+        <w:t>[通道3 EPC状态][通道3 EPC 8字][通道3 USER状态][通道3 USER WORDS字]</w:t>
+      </w:r>
+    </w:p>
+    <w:p>
+      <w:pPr/>
+      <w:r>
+        <w:t>[通道2 EPC状态][通道2 EPC 8字][通道2 USER状态][通道2 USER WORDS字]</w:t>
+      </w:r>
+    </w:p>
+    <w:p>
+      <w:pPr/>
+      <w:r>
+        <w:t>[通道1 EPC状态][通道1 EPC 8字][通道1 USER状态][通道1 USER WORDS字]</w:t>
+      </w:r>
+    </w:p>
+    <w:p>
+      <w:pPr/>
+      <w:r>
+        <w:t>输出格式（RETURN_DATA，每通道固定 1+8+1+WORDS 字）：</w:t>
+      </w:r>
+    </w:p>
+    <w:p>
+      <w:pPr/>
+      <w:r>
+        <w:t>EPC 长度按标签 PC 字自动适配，固定输出 8 字（不足补 0，超出截断），保证每通道固定长度。</w:t>
+      </w:r>
+    </w:p>
+    <w:p>
+      <w:pPr/>
+      <w:r>
+        <w:t>输入：ADDR=USER 区起始地址（通常 0），WORDS=USER 区每通道读几字（1~32），ANT 不用（固定读 1+2+3）。</w:t>
+      </w:r>
+    </w:p>
+    <w:p>
+      <w:pPr/>
+      <w:r>
+        <w:t>功能：一条命令依次读通道 1/2/3 的 EPC + USER 区，结果拼在 RETURN_DATA 返回，省 PLC 发三次命令。</w:t>
+      </w:r>
+    </w:p>
+    <w:p>
+      <w:pPr/>
+      <w:r>
+        <w:t>功能：读取标签 RFU（Reserved）存储区，含 Kill/Access 密码。RFU 区固定 4 字（64 位）。写禁止——误写密码可能报废标签。</w:t>
+      </w:r>
+    </w:p>
+    <w:p>
+      <w:pPr/>
+      <w:r>
+        <w:t>参数：ADDR=起始地址，WORDS=读取字数（1~4）。返回：RETURN_DATA 为 RFU 数据。</w:t>
+      </w:r>
+    </w:p>
+    <w:p>
+      <w:pPr>
+        <w:pStyle w:val="5"/>
+      </w:pPr>
+      <w:r>
+        <w:t>案例：ANT1 读 RFU 4 字</w:t>
+      </w:r>
+    </w:p>
+    <w:tbl>
+      <w:tblPr>
+        <w:tblStyle w:val="33"/>
+        <w:tblW w:type="auto" w:w="0"/>
+        <w:tblLook w:firstColumn="1" w:firstRow="1" w:lastColumn="0" w:lastRow="0" w:noHBand="0" w:noVBand="1" w:val="04A0"/>
+      </w:tblPr>
+      <w:tblGrid>
+        <w:gridCol w:w="2160"/>
+        <w:gridCol w:w="2160"/>
+        <w:gridCol w:w="2160"/>
+        <w:gridCol w:w="2160"/>
+      </w:tblGrid>
+      <w:tr>
+        <w:tc>
+          <w:tcPr>
+            <w:tcW w:type="dxa" w:w="2160"/>
+          </w:tcPr>
+          <w:p>
+            <w:r>
+              <w:t>步骤</w:t>
+            </w:r>
+          </w:p>
+        </w:tc>
+        <w:tc>
+          <w:tcPr>
+            <w:tcW w:type="dxa" w:w="2160"/>
+          </w:tcPr>
+          <w:p>
+            <w:r>
+              <w:t>变量</w:t>
+            </w:r>
+          </w:p>
+        </w:tc>
+        <w:tc>
+          <w:tcPr>
+            <w:tcW w:type="dxa" w:w="2160"/>
+          </w:tcPr>
+          <w:p>
+            <w:r>
+              <w:t>值</w:t>
+            </w:r>
+          </w:p>
+        </w:tc>
+        <w:tc>
+          <w:tcPr>
+            <w:tcW w:type="dxa" w:w="2160"/>
+          </w:tcPr>
+          <w:p>
+            <w:r>
+              <w:t>说明</w:t>
+            </w:r>
+          </w:p>
+        </w:tc>
+      </w:tr>
+      <w:tr>
+        <w:tc>
+          <w:tcPr>
+            <w:tcW w:type="dxa" w:w="2160"/>
+          </w:tcPr>
+          <w:p>
+            <w:r>
+              <w:t>①</w:t>
+            </w:r>
+          </w:p>
+        </w:tc>
+        <w:tc>
+          <w:tcPr>
+            <w:tcW w:type="dxa" w:w="2160"/>
+          </w:tcPr>
+          <w:p>
+            <w:r>
+              <w:t>CMD</w:t>
+            </w:r>
+          </w:p>
+        </w:tc>
+        <w:tc>
+          <w:tcPr>
+            <w:tcW w:type="dxa" w:w="2160"/>
+          </w:tcPr>
+          <w:p>
+            <w:r>
+              <w:t>0</w:t>
+            </w:r>
+          </w:p>
+        </w:tc>
+        <w:tc>
+          <w:tcPr>
+            <w:tcW w:type="dxa" w:w="2160"/>
+          </w:tcPr>
+          <w:p>
+            <w:r>
+              <w:t>复位命令</w:t>
+            </w:r>
+          </w:p>
+        </w:tc>
+      </w:tr>
+      <w:tr>
+        <w:tc>
+          <w:tcPr>
+            <w:tcW w:type="dxa" w:w="2160"/>
+          </w:tcPr>
+          <w:p>
+            <w:r>
+              <w:t>②</w:t>
+            </w:r>
+          </w:p>
+        </w:tc>
+        <w:tc>
+          <w:tcPr>
+            <w:tcW w:type="dxa" w:w="2160"/>
+          </w:tcPr>
+          <w:p>
+            <w:r>
+              <w:t>ANT</w:t>
+            </w:r>
+          </w:p>
+        </w:tc>
+        <w:tc>
+          <w:tcPr>
+            <w:tcW w:type="dxa" w:w="2160"/>
+          </w:tcPr>
+          <w:p>
+            <w:r>
+              <w:t>1</w:t>
+            </w:r>
+          </w:p>
+        </w:tc>
+        <w:tc>
+          <w:tcPr>
+            <w:tcW w:type="dxa" w:w="2160"/>
+          </w:tcPr>
+          <w:p>
+            <w:r>
+              <w:t>天线 1</w:t>
+            </w:r>
+          </w:p>
+        </w:tc>
+      </w:tr>
+      <w:tr>
+        <w:tc>
+          <w:tcPr>
+            <w:tcW w:type="dxa" w:w="2160"/>
+          </w:tcPr>
+          <w:p>
+            <w:r>
+              <w:t>②</w:t>
+            </w:r>
+          </w:p>
+        </w:tc>
+        <w:tc>
+          <w:tcPr>
+            <w:tcW w:type="dxa" w:w="2160"/>
+          </w:tcPr>
+          <w:p>
+            <w:r>
+              <w:t>ADDR</w:t>
+            </w:r>
+          </w:p>
+        </w:tc>
+        <w:tc>
+          <w:tcPr>
+            <w:tcW w:type="dxa" w:w="2160"/>
+          </w:tcPr>
+          <w:p>
+            <w:r>
+              <w:t>0</w:t>
+            </w:r>
+          </w:p>
+        </w:tc>
+        <w:tc>
+          <w:tcPr>
+            <w:tcW w:type="dxa" w:w="2160"/>
+          </w:tcPr>
+          <w:p>
+            <w:r>
+              <w:t>起始地址 0</w:t>
+            </w:r>
+          </w:p>
+        </w:tc>
+      </w:tr>
+      <w:tr>
+        <w:tc>
+          <w:tcPr>
+            <w:tcW w:type="dxa" w:w="2160"/>
+          </w:tcPr>
+          <w:p>
+            <w:r>
+              <w:t>②</w:t>
+            </w:r>
+          </w:p>
+        </w:tc>
+        <w:tc>
+          <w:tcPr>
+            <w:tcW w:type="dxa" w:w="2160"/>
+          </w:tcPr>
+          <w:p>
+            <w:r>
+              <w:t>WORDS</w:t>
+            </w:r>
+          </w:p>
+        </w:tc>
+        <w:tc>
+          <w:tcPr>
+            <w:tcW w:type="dxa" w:w="2160"/>
+          </w:tcPr>
+          <w:p>
+            <w:r>
+              <w:t>4</w:t>
+            </w:r>
+          </w:p>
+        </w:tc>
+        <w:tc>
+          <w:tcPr>
+            <w:tcW w:type="dxa" w:w="2160"/>
+          </w:tcPr>
+          <w:p>
+            <w:r>
+              <w:t>读 4 words = 8 bytes</w:t>
+            </w:r>
+          </w:p>
+        </w:tc>
+      </w:tr>
+      <w:tr>
+        <w:tc>
+          <w:tcPr>
+            <w:tcW w:type="dxa" w:w="2160"/>
+          </w:tcPr>
+          <w:p>
+            <w:r>
+              <w:t>③</w:t>
+            </w:r>
+          </w:p>
+        </w:tc>
+        <w:tc>
+          <w:tcPr>
+            <w:tcW w:type="dxa" w:w="2160"/>
+          </w:tcPr>
+          <w:p>
+            <w:r>
+              <w:t>CMD</w:t>
+            </w:r>
+          </w:p>
+        </w:tc>
+        <w:tc>
+          <w:tcPr>
+            <w:tcW w:type="dxa" w:w="2160"/>
+          </w:tcPr>
+          <w:p>
+            <w:r>
+              <w:t>32</w:t>
+            </w:r>
+          </w:p>
+        </w:tc>
+        <w:tc>
+          <w:tcPr>
+            <w:tcW w:type="dxa" w:w="2160"/>
+          </w:tcPr>
+          <w:p>
+            <w:r>
+              <w:t>触发命令</w:t>
+            </w:r>
+          </w:p>
+        </w:tc>
+      </w:tr>
+      <w:tr>
+        <w:tc>
+          <w:tcPr>
+            <w:tcW w:type="dxa" w:w="2160"/>
+          </w:tcPr>
+          <w:p>
+            <w:r>
+              <w:t>④</w:t>
+            </w:r>
+          </w:p>
+        </w:tc>
+        <w:tc>
+          <w:tcPr>
+            <w:tcW w:type="dxa" w:w="2160"/>
+          </w:tcPr>
+          <w:p>
+            <w:r>
+              <w:t>等待</w:t>
+            </w:r>
+          </w:p>
+        </w:tc>
+        <w:tc>
+          <w:tcPr>
+            <w:tcW w:type="dxa" w:w="2160"/>
+          </w:tcPr>
+          <w:p>
+            <w:r>
+              <w:t>—</w:t>
+            </w:r>
+          </w:p>
+        </w:tc>
+        <w:tc>
+          <w:tcPr>
+            <w:tcW w:type="dxa" w:w="2160"/>
+          </w:tcPr>
+          <w:p>
+            <w:r>
+              <w:t>CMD_STATUS=2</w:t>
+            </w:r>
+          </w:p>
+        </w:tc>
+      </w:tr>
+      <w:tr>
+        <w:tc>
+          <w:tcPr>
+            <w:tcW w:type="dxa" w:w="2160"/>
+          </w:tcPr>
+          <w:p>
+            <w:r>
+              <w:t>⑤</w:t>
+            </w:r>
+          </w:p>
+        </w:tc>
+        <w:tc>
+          <w:tcPr>
+            <w:tcW w:type="dxa" w:w="2160"/>
+          </w:tcPr>
+          <w:p>
+            <w:r>
+              <w:t>RETURN_DATA_LEN</w:t>
+            </w:r>
+          </w:p>
+        </w:tc>
+        <w:tc>
+          <w:tcPr>
+            <w:tcW w:type="dxa" w:w="2160"/>
+          </w:tcPr>
+          <w:p>
+            <w:r>
+              <w:t>8</w:t>
+            </w:r>
+          </w:p>
+        </w:tc>
+        <w:tc>
+          <w:tcPr>
+            <w:tcW w:type="dxa" w:w="2160"/>
+          </w:tcPr>
+          <w:p>
+            <w:r>
+              <w:t>返回 8 字节</w:t>
+            </w:r>
+          </w:p>
+        </w:tc>
+      </w:tr>
+      <w:tr>
+        <w:tc>
+          <w:tcPr>
+            <w:tcW w:type="dxa" w:w="2160"/>
+          </w:tcPr>
+          <w:p>
+            <w:r>
+              <w:t>⑤</w:t>
+            </w:r>
+          </w:p>
+        </w:tc>
+        <w:tc>
+          <w:tcPr>
+            <w:tcW w:type="dxa" w:w="2160"/>
+          </w:tcPr>
+          <w:p>
+            <w:r>
+              <w:t>RETURN_DATA1..4</w:t>
+            </w:r>
+          </w:p>
+        </w:tc>
+        <w:tc>
+          <w:tcPr>
+            <w:tcW w:type="dxa" w:w="2160"/>
+          </w:tcPr>
+          <w:p>
+            <w:r>
+              <w:t>—</w:t>
+            </w:r>
+          </w:p>
+        </w:tc>
+        <w:tc>
+          <w:tcPr>
+            <w:tcW w:type="dxa" w:w="2160"/>
+          </w:tcPr>
+          <w:p>
+            <w:r>
+              <w:t>RFU 数据</w:t>
+            </w:r>
+          </w:p>
+        </w:tc>
+      </w:tr>
+      <w:tr>
+        <w:tc>
+          <w:tcPr>
+            <w:tcW w:type="dxa" w:w="2160"/>
+          </w:tcPr>
+          <w:p>
+            <w:r>
+              <w:t>⑥</w:t>
+            </w:r>
+          </w:p>
+        </w:tc>
+        <w:tc>
+          <w:tcPr>
+            <w:tcW w:type="dxa" w:w="2160"/>
+          </w:tcPr>
+          <w:p>
+            <w:r>
+              <w:t>CMD</w:t>
+            </w:r>
+          </w:p>
+        </w:tc>
+        <w:tc>
+          <w:tcPr>
+            <w:tcW w:type="dxa" w:w="2160"/>
+          </w:tcPr>
+          <w:p>
+            <w:r>
+              <w:t>0</w:t>
+            </w:r>
+          </w:p>
+        </w:tc>
+        <w:tc>
+          <w:tcPr>
+            <w:tcW w:type="dxa" w:w="2160"/>
+          </w:tcPr>
+          <w:p>
+            <w:r>
+              <w:t>复位命令</w:t>
+            </w:r>
+          </w:p>
+        </w:tc>
+      </w:tr>
+    </w:tbl>
+    <w:p>
+      <w:pPr>
+        <w:pStyle w:val="4"/>
+      </w:pPr>
+      <w:r>
+        <w:t>CMD 32 — 读标签 RFU 区（密码区）</w:t>
+      </w:r>
+    </w:p>
+    <w:p>
+      <w:pPr>
+        <w:pStyle w:val="4"/>
+      </w:pPr>
+      <w:r>
+        <w:t>CMD 33 — 一键读三通道 EPC+USER</w:t>
+      </w:r>
+    </w:p>
     <w:p>
       <w:pPr>
         <w:pStyle w:val="4"/>
@@ -37832,1088 +38914,6 @@
         <w:t>• 新增 CMD 33 一键读三通道 EPC+USER</w:t>
       </w:r>
     </w:p>
-    <w:p>
-      <w:pPr>
-        <w:pStyle w:val="4"/>
-      </w:pPr>
-      <w:r>
-        <w:t>CMD 32 — 读标签 RFU 区（密码区）</w:t>
-      </w:r>
-    </w:p>
-    <w:p>
-      <w:pPr/>
-      <w:r>
-        <w:t>功能：读取标签 RFU（Reserved）存储区，含 Kill/Access 密码。RFU 区固定 4 字（64 位）。写禁止——误写密码可能报废标签。</w:t>
-      </w:r>
-    </w:p>
-    <w:p>
-      <w:pPr/>
-      <w:r>
-        <w:t>参数：ADDR=起始地址，WORDS=读取字数（1~4）。返回：RETURN_DATA 为 RFU 数据。</w:t>
-      </w:r>
-    </w:p>
-    <w:p>
-      <w:pPr>
-        <w:pStyle w:val="5"/>
-      </w:pPr>
-      <w:r>
-        <w:t>案例：ANT1 读 RFU 4 字</w:t>
-      </w:r>
-    </w:p>
-    <w:tbl>
-      <w:tblPr>
-        <w:tblStyle w:val="33"/>
-        <w:tblW w:type="auto" w:w="0"/>
-        <w:tblLook w:firstColumn="1" w:firstRow="1" w:lastColumn="0" w:lastRow="0" w:noHBand="0" w:noVBand="1" w:val="04A0"/>
-      </w:tblPr>
-      <w:tblGrid>
-        <w:gridCol w:w="2160"/>
-        <w:gridCol w:w="2160"/>
-        <w:gridCol w:w="2160"/>
-        <w:gridCol w:w="2160"/>
-      </w:tblGrid>
-      <w:tr>
-        <w:tc>
-          <w:tcPr>
-            <w:tcW w:type="dxa" w:w="2160"/>
-          </w:tcPr>
-          <w:p>
-            <w:r>
-              <w:t>步骤</w:t>
-            </w:r>
-          </w:p>
-        </w:tc>
-        <w:tc>
-          <w:tcPr>
-            <w:tcW w:type="dxa" w:w="2160"/>
-          </w:tcPr>
-          <w:p>
-            <w:r>
-              <w:t>变量</w:t>
-            </w:r>
-          </w:p>
-        </w:tc>
-        <w:tc>
-          <w:tcPr>
-            <w:tcW w:type="dxa" w:w="2160"/>
-          </w:tcPr>
-          <w:p>
-            <w:r>
-              <w:t>值</w:t>
-            </w:r>
-          </w:p>
-        </w:tc>
-        <w:tc>
-          <w:tcPr>
-            <w:tcW w:type="dxa" w:w="2160"/>
-          </w:tcPr>
-          <w:p>
-            <w:r>
-              <w:t>说明</w:t>
-            </w:r>
-          </w:p>
-        </w:tc>
-      </w:tr>
-      <w:tr>
-        <w:tc>
-          <w:tcPr>
-            <w:tcW w:type="dxa" w:w="2160"/>
-          </w:tcPr>
-          <w:p>
-            <w:r>
-              <w:t>①</w:t>
-            </w:r>
-          </w:p>
-        </w:tc>
-        <w:tc>
-          <w:tcPr>
-            <w:tcW w:type="dxa" w:w="2160"/>
-          </w:tcPr>
-          <w:p>
-            <w:r>
-              <w:t>CMD</w:t>
-            </w:r>
-          </w:p>
-        </w:tc>
-        <w:tc>
-          <w:tcPr>
-            <w:tcW w:type="dxa" w:w="2160"/>
-          </w:tcPr>
-          <w:p>
-            <w:r>
-              <w:t>0</w:t>
-            </w:r>
-          </w:p>
-        </w:tc>
-        <w:tc>
-          <w:tcPr>
-            <w:tcW w:type="dxa" w:w="2160"/>
-          </w:tcPr>
-          <w:p>
-            <w:r>
-              <w:t>复位命令</w:t>
-            </w:r>
-          </w:p>
-        </w:tc>
-      </w:tr>
-      <w:tr>
-        <w:tc>
-          <w:tcPr>
-            <w:tcW w:type="dxa" w:w="2160"/>
-          </w:tcPr>
-          <w:p>
-            <w:r>
-              <w:t>②</w:t>
-            </w:r>
-          </w:p>
-        </w:tc>
-        <w:tc>
-          <w:tcPr>
-            <w:tcW w:type="dxa" w:w="2160"/>
-          </w:tcPr>
-          <w:p>
-            <w:r>
-              <w:t>ANT</w:t>
-            </w:r>
-          </w:p>
-        </w:tc>
-        <w:tc>
-          <w:tcPr>
-            <w:tcW w:type="dxa" w:w="2160"/>
-          </w:tcPr>
-          <w:p>
-            <w:r>
-              <w:t>1</w:t>
-            </w:r>
-          </w:p>
-        </w:tc>
-        <w:tc>
-          <w:tcPr>
-            <w:tcW w:type="dxa" w:w="2160"/>
-          </w:tcPr>
-          <w:p>
-            <w:r>
-              <w:t>天线 1</w:t>
-            </w:r>
-          </w:p>
-        </w:tc>
-      </w:tr>
-      <w:tr>
-        <w:tc>
-          <w:tcPr>
-            <w:tcW w:type="dxa" w:w="2160"/>
-          </w:tcPr>
-          <w:p>
-            <w:r>
-              <w:t>②</w:t>
-            </w:r>
-          </w:p>
-        </w:tc>
-        <w:tc>
-          <w:tcPr>
-            <w:tcW w:type="dxa" w:w="2160"/>
-          </w:tcPr>
-          <w:p>
-            <w:r>
-              <w:t>ADDR</w:t>
-            </w:r>
-          </w:p>
-        </w:tc>
-        <w:tc>
-          <w:tcPr>
-            <w:tcW w:type="dxa" w:w="2160"/>
-          </w:tcPr>
-          <w:p>
-            <w:r>
-              <w:t>0</w:t>
-            </w:r>
-          </w:p>
-        </w:tc>
-        <w:tc>
-          <w:tcPr>
-            <w:tcW w:type="dxa" w:w="2160"/>
-          </w:tcPr>
-          <w:p>
-            <w:r>
-              <w:t>起始地址 0</w:t>
-            </w:r>
-          </w:p>
-        </w:tc>
-      </w:tr>
-      <w:tr>
-        <w:tc>
-          <w:tcPr>
-            <w:tcW w:type="dxa" w:w="2160"/>
-          </w:tcPr>
-          <w:p>
-            <w:r>
-              <w:t>②</w:t>
-            </w:r>
-          </w:p>
-        </w:tc>
-        <w:tc>
-          <w:tcPr>
-            <w:tcW w:type="dxa" w:w="2160"/>
-          </w:tcPr>
-          <w:p>
-            <w:r>
-              <w:t>WORDS</w:t>
-            </w:r>
-          </w:p>
-        </w:tc>
-        <w:tc>
-          <w:tcPr>
-            <w:tcW w:type="dxa" w:w="2160"/>
-          </w:tcPr>
-          <w:p>
-            <w:r>
-              <w:t>4</w:t>
-            </w:r>
-          </w:p>
-        </w:tc>
-        <w:tc>
-          <w:tcPr>
-            <w:tcW w:type="dxa" w:w="2160"/>
-          </w:tcPr>
-          <w:p>
-            <w:r>
-              <w:t>读 4 words = 8 bytes</w:t>
-            </w:r>
-          </w:p>
-        </w:tc>
-      </w:tr>
-      <w:tr>
-        <w:tc>
-          <w:tcPr>
-            <w:tcW w:type="dxa" w:w="2160"/>
-          </w:tcPr>
-          <w:p>
-            <w:r>
-              <w:t>③</w:t>
-            </w:r>
-          </w:p>
-        </w:tc>
-        <w:tc>
-          <w:tcPr>
-            <w:tcW w:type="dxa" w:w="2160"/>
-          </w:tcPr>
-          <w:p>
-            <w:r>
-              <w:t>CMD</w:t>
-            </w:r>
-          </w:p>
-        </w:tc>
-        <w:tc>
-          <w:tcPr>
-            <w:tcW w:type="dxa" w:w="2160"/>
-          </w:tcPr>
-          <w:p>
-            <w:r>
-              <w:t>32</w:t>
-            </w:r>
-          </w:p>
-        </w:tc>
-        <w:tc>
-          <w:tcPr>
-            <w:tcW w:type="dxa" w:w="2160"/>
-          </w:tcPr>
-          <w:p>
-            <w:r>
-              <w:t>触发命令</w:t>
-            </w:r>
-          </w:p>
-        </w:tc>
-      </w:tr>
-      <w:tr>
-        <w:tc>
-          <w:tcPr>
-            <w:tcW w:type="dxa" w:w="2160"/>
-          </w:tcPr>
-          <w:p>
-            <w:r>
-              <w:t>④</w:t>
-            </w:r>
-          </w:p>
-        </w:tc>
-        <w:tc>
-          <w:tcPr>
-            <w:tcW w:type="dxa" w:w="2160"/>
-          </w:tcPr>
-          <w:p>
-            <w:r>
-              <w:t>等待</w:t>
-            </w:r>
-          </w:p>
-        </w:tc>
-        <w:tc>
-          <w:tcPr>
-            <w:tcW w:type="dxa" w:w="2160"/>
-          </w:tcPr>
-          <w:p>
-            <w:r>
-              <w:t>—</w:t>
-            </w:r>
-          </w:p>
-        </w:tc>
-        <w:tc>
-          <w:tcPr>
-            <w:tcW w:type="dxa" w:w="2160"/>
-          </w:tcPr>
-          <w:p>
-            <w:r>
-              <w:t>CMD_STATUS=2</w:t>
-            </w:r>
-          </w:p>
-        </w:tc>
-      </w:tr>
-      <w:tr>
-        <w:tc>
-          <w:tcPr>
-            <w:tcW w:type="dxa" w:w="2160"/>
-          </w:tcPr>
-          <w:p>
-            <w:r>
-              <w:t>⑤</w:t>
-            </w:r>
-          </w:p>
-        </w:tc>
-        <w:tc>
-          <w:tcPr>
-            <w:tcW w:type="dxa" w:w="2160"/>
-          </w:tcPr>
-          <w:p>
-            <w:r>
-              <w:t>RETURN_DATA_LEN</w:t>
-            </w:r>
-          </w:p>
-        </w:tc>
-        <w:tc>
-          <w:tcPr>
-            <w:tcW w:type="dxa" w:w="2160"/>
-          </w:tcPr>
-          <w:p>
-            <w:r>
-              <w:t>8</w:t>
-            </w:r>
-          </w:p>
-        </w:tc>
-        <w:tc>
-          <w:tcPr>
-            <w:tcW w:type="dxa" w:w="2160"/>
-          </w:tcPr>
-          <w:p>
-            <w:r>
-              <w:t>返回 8 字节</w:t>
-            </w:r>
-          </w:p>
-        </w:tc>
-      </w:tr>
-      <w:tr>
-        <w:tc>
-          <w:tcPr>
-            <w:tcW w:type="dxa" w:w="2160"/>
-          </w:tcPr>
-          <w:p>
-            <w:r>
-              <w:t>⑤</w:t>
-            </w:r>
-          </w:p>
-        </w:tc>
-        <w:tc>
-          <w:tcPr>
-            <w:tcW w:type="dxa" w:w="2160"/>
-          </w:tcPr>
-          <w:p>
-            <w:r>
-              <w:t>RETURN_DATA1..4</w:t>
-            </w:r>
-          </w:p>
-        </w:tc>
-        <w:tc>
-          <w:tcPr>
-            <w:tcW w:type="dxa" w:w="2160"/>
-          </w:tcPr>
-          <w:p>
-            <w:r>
-              <w:t>—</w:t>
-            </w:r>
-          </w:p>
-        </w:tc>
-        <w:tc>
-          <w:tcPr>
-            <w:tcW w:type="dxa" w:w="2160"/>
-          </w:tcPr>
-          <w:p>
-            <w:r>
-              <w:t>RFU 数据</w:t>
-            </w:r>
-          </w:p>
-        </w:tc>
-      </w:tr>
-      <w:tr>
-        <w:tc>
-          <w:tcPr>
-            <w:tcW w:type="dxa" w:w="2160"/>
-          </w:tcPr>
-          <w:p>
-            <w:r>
-              <w:t>⑥</w:t>
-            </w:r>
-          </w:p>
-        </w:tc>
-        <w:tc>
-          <w:tcPr>
-            <w:tcW w:type="dxa" w:w="2160"/>
-          </w:tcPr>
-          <w:p>
-            <w:r>
-              <w:t>CMD</w:t>
-            </w:r>
-          </w:p>
-        </w:tc>
-        <w:tc>
-          <w:tcPr>
-            <w:tcW w:type="dxa" w:w="2160"/>
-          </w:tcPr>
-          <w:p>
-            <w:r>
-              <w:t>0</w:t>
-            </w:r>
-          </w:p>
-        </w:tc>
-        <w:tc>
-          <w:tcPr>
-            <w:tcW w:type="dxa" w:w="2160"/>
-          </w:tcPr>
-          <w:p>
-            <w:r>
-              <w:t>复位命令</w:t>
-            </w:r>
-          </w:p>
-        </w:tc>
-      </w:tr>
-    </w:tbl>
-    <w:p>
-      <w:pPr>
-        <w:pStyle w:val="4"/>
-      </w:pPr>
-      <w:r>
-        <w:t>CMD 33 — 一键读三通道 EPC+USER</w:t>
-      </w:r>
-    </w:p>
-    <w:p>
-      <w:pPr/>
-      <w:r>
-        <w:t>功能：一条命令依次读通道 1/2/3 的 EPC + USER 区，结果拼在 RETURN_DATA 返回，省 PLC 发三次命令。</w:t>
-      </w:r>
-    </w:p>
-    <w:p>
-      <w:pPr/>
-      <w:r>
-        <w:t>输入：ADDR=USER 区起始地址（通常 0），WORDS=USER 区每通道读几字（1~32），ANT 不用（固定读 1+2+3）。</w:t>
-      </w:r>
-    </w:p>
-    <w:p>
-      <w:pPr/>
-      <w:r>
-        <w:t>EPC 长度按标签 PC 字自动适配，固定输出 8 字（不足补 0，超出截断），保证每通道固定长度。</w:t>
-      </w:r>
-    </w:p>
-    <w:p>
-      <w:pPr/>
-      <w:r>
-        <w:t>输出格式（RETURN_DATA，每通道固定 1+8+1+WORDS 字）：</w:t>
-      </w:r>
-    </w:p>
-    <w:p>
-      <w:pPr/>
-      <w:r>
-        <w:t>[通道1 EPC状态][通道1 EPC 8字][通道1 USER状态][通道1 USER WORDS字]</w:t>
-      </w:r>
-    </w:p>
-    <w:p>
-      <w:pPr/>
-      <w:r>
-        <w:t>[通道2 EPC状态][通道2 EPC 8字][通道2 USER状态][通道2 USER WORDS字]</w:t>
-      </w:r>
-    </w:p>
-    <w:p>
-      <w:pPr/>
-      <w:r>
-        <w:t>[通道3 EPC状态][通道3 EPC 8字][通道3 USER状态][通道3 USER WORDS字]</w:t>
-      </w:r>
-    </w:p>
-    <w:p>
-      <w:pPr/>
-      <w:r>
-        <w:t>• 每段前 1 字状态：0=成功，非 0=错误码（如 0x15 无标签、0x09 读失败）</w:t>
-      </w:r>
-    </w:p>
-    <w:p>
-      <w:pPr/>
-      <w:r>
-        <w:t>• 失败通道：状态写错误码，EPC/USER 数据填 0，继续下一通道</w:t>
-      </w:r>
-    </w:p>
-    <w:p>
-      <w:pPr/>
-      <w:r>
-        <w:t>• RETURN_DATA_LEN = 3 × (1+8+1+WORDS) × 2 字节</w:t>
-      </w:r>
-    </w:p>
-    <w:p>
-      <w:pPr>
-        <w:pStyle w:val="5"/>
-      </w:pPr>
-      <w:r>
-        <w:t>PLC 解析（WORDS=8 为例，每通道 18 字）：</w:t>
-      </w:r>
-    </w:p>
-    <w:tbl>
-      <w:tblPr>
-        <w:tblStyle w:val="33"/>
-        <w:tblW w:type="auto" w:w="0"/>
-        <w:tblLook w:firstColumn="1" w:firstRow="1" w:lastColumn="0" w:lastRow="0" w:noHBand="0" w:noVBand="1" w:val="04A0"/>
-      </w:tblPr>
-      <w:tblGrid>
-        <w:gridCol w:w="2880"/>
-        <w:gridCol w:w="2880"/>
-        <w:gridCol w:w="2880"/>
-      </w:tblGrid>
-      <w:tr>
-        <w:tc>
-          <w:tcPr>
-            <w:tcW w:type="dxa" w:w="2880"/>
-          </w:tcPr>
-          <w:p>
-            <w:r>
-              <w:t>通道</w:t>
-            </w:r>
-          </w:p>
-        </w:tc>
-        <w:tc>
-          <w:tcPr>
-            <w:tcW w:type="dxa" w:w="2880"/>
-          </w:tcPr>
-          <w:p>
-            <w:r>
-              <w:t>EPC</w:t>
-            </w:r>
-          </w:p>
-        </w:tc>
-        <w:tc>
-          <w:tcPr>
-            <w:tcW w:type="dxa" w:w="2880"/>
-          </w:tcPr>
-          <w:p>
-            <w:r>
-              <w:t>USER</w:t>
-            </w:r>
-          </w:p>
-        </w:tc>
-      </w:tr>
-      <w:tr>
-        <w:tc>
-          <w:tcPr>
-            <w:tcW w:type="dxa" w:w="2880"/>
-          </w:tcPr>
-          <w:p>
-            <w:r>
-              <w:t>通道1</w:t>
-            </w:r>
-          </w:p>
-        </w:tc>
-        <w:tc>
-          <w:tcPr>
-            <w:tcW w:type="dxa" w:w="2880"/>
-          </w:tcPr>
-          <w:p>
-            <w:r>
-              <w:t>RETURN_DATA1=状态, RETURN_DATA2~9=EPC</w:t>
-            </w:r>
-          </w:p>
-        </w:tc>
-        <w:tc>
-          <w:tcPr>
-            <w:tcW w:type="dxa" w:w="2880"/>
-          </w:tcPr>
-          <w:p>
-            <w:r>
-              <w:t>RETURN_DATA10=状态, RETURN_DATA11~18=USER</w:t>
-            </w:r>
-          </w:p>
-        </w:tc>
-      </w:tr>
-      <w:tr>
-        <w:tc>
-          <w:tcPr>
-            <w:tcW w:type="dxa" w:w="2880"/>
-          </w:tcPr>
-          <w:p>
-            <w:r>
-              <w:t>通道2</w:t>
-            </w:r>
-          </w:p>
-        </w:tc>
-        <w:tc>
-          <w:tcPr>
-            <w:tcW w:type="dxa" w:w="2880"/>
-          </w:tcPr>
-          <w:p>
-            <w:r>
-              <w:t>RETURN_DATA19=状态, RETURN_DATA20~27=EPC</w:t>
-            </w:r>
-          </w:p>
-        </w:tc>
-        <w:tc>
-          <w:tcPr>
-            <w:tcW w:type="dxa" w:w="2880"/>
-          </w:tcPr>
-          <w:p>
-            <w:r>
-              <w:t>RETURN_DATA28=状态, RETURN_DATA29~36=USER</w:t>
-            </w:r>
-          </w:p>
-        </w:tc>
-      </w:tr>
-      <w:tr>
-        <w:tc>
-          <w:tcPr>
-            <w:tcW w:type="dxa" w:w="2880"/>
-          </w:tcPr>
-          <w:p>
-            <w:r>
-              <w:t>通道3</w:t>
-            </w:r>
-          </w:p>
-        </w:tc>
-        <w:tc>
-          <w:tcPr>
-            <w:tcW w:type="dxa" w:w="2880"/>
-          </w:tcPr>
-          <w:p>
-            <w:r>
-              <w:t>RETURN_DATA37=状态, RETURN_DATA38~45=EPC</w:t>
-            </w:r>
-          </w:p>
-        </w:tc>
-        <w:tc>
-          <w:tcPr>
-            <w:tcW w:type="dxa" w:w="2880"/>
-          </w:tcPr>
-          <w:p>
-            <w:r>
-              <w:t>RETURN_DATA46=状态, RETURN_DATA47~54=USER</w:t>
-            </w:r>
-          </w:p>
-        </w:tc>
-      </w:tr>
-    </w:tbl>
-    <w:p>
-      <w:pPr>
-        <w:pStyle w:val="5"/>
-      </w:pPr>
-      <w:r>
-        <w:t>案例：读三通道 EPC+USER 8 字</w:t>
-      </w:r>
-    </w:p>
-    <w:tbl>
-      <w:tblPr>
-        <w:tblStyle w:val="33"/>
-        <w:tblW w:type="auto" w:w="0"/>
-        <w:tblLook w:firstColumn="1" w:firstRow="1" w:lastColumn="0" w:lastRow="0" w:noHBand="0" w:noVBand="1" w:val="04A0"/>
-      </w:tblPr>
-      <w:tblGrid>
-        <w:gridCol w:w="2160"/>
-        <w:gridCol w:w="2160"/>
-        <w:gridCol w:w="2160"/>
-        <w:gridCol w:w="2160"/>
-      </w:tblGrid>
-      <w:tr>
-        <w:tc>
-          <w:tcPr>
-            <w:tcW w:type="dxa" w:w="2160"/>
-          </w:tcPr>
-          <w:p>
-            <w:r>
-              <w:t>步骤</w:t>
-            </w:r>
-          </w:p>
-        </w:tc>
-        <w:tc>
-          <w:tcPr>
-            <w:tcW w:type="dxa" w:w="2160"/>
-          </w:tcPr>
-          <w:p>
-            <w:r>
-              <w:t>变量</w:t>
-            </w:r>
-          </w:p>
-        </w:tc>
-        <w:tc>
-          <w:tcPr>
-            <w:tcW w:type="dxa" w:w="2160"/>
-          </w:tcPr>
-          <w:p>
-            <w:r>
-              <w:t>值</w:t>
-            </w:r>
-          </w:p>
-        </w:tc>
-        <w:tc>
-          <w:tcPr>
-            <w:tcW w:type="dxa" w:w="2160"/>
-          </w:tcPr>
-          <w:p>
-            <w:r>
-              <w:t>说明</w:t>
-            </w:r>
-          </w:p>
-        </w:tc>
-      </w:tr>
-      <w:tr>
-        <w:tc>
-          <w:tcPr>
-            <w:tcW w:type="dxa" w:w="2160"/>
-          </w:tcPr>
-          <w:p>
-            <w:r>
-              <w:t>①</w:t>
-            </w:r>
-          </w:p>
-        </w:tc>
-        <w:tc>
-          <w:tcPr>
-            <w:tcW w:type="dxa" w:w="2160"/>
-          </w:tcPr>
-          <w:p>
-            <w:r>
-              <w:t>CMD</w:t>
-            </w:r>
-          </w:p>
-        </w:tc>
-        <w:tc>
-          <w:tcPr>
-            <w:tcW w:type="dxa" w:w="2160"/>
-          </w:tcPr>
-          <w:p>
-            <w:r>
-              <w:t>0</w:t>
-            </w:r>
-          </w:p>
-        </w:tc>
-        <w:tc>
-          <w:tcPr>
-            <w:tcW w:type="dxa" w:w="2160"/>
-          </w:tcPr>
-          <w:p>
-            <w:r>
-              <w:t>复位命令</w:t>
-            </w:r>
-          </w:p>
-        </w:tc>
-      </w:tr>
-      <w:tr>
-        <w:tc>
-          <w:tcPr>
-            <w:tcW w:type="dxa" w:w="2160"/>
-          </w:tcPr>
-          <w:p>
-            <w:r>
-              <w:t>②</w:t>
-            </w:r>
-          </w:p>
-        </w:tc>
-        <w:tc>
-          <w:tcPr>
-            <w:tcW w:type="dxa" w:w="2160"/>
-          </w:tcPr>
-          <w:p>
-            <w:r>
-              <w:t>ADDR</w:t>
-            </w:r>
-          </w:p>
-        </w:tc>
-        <w:tc>
-          <w:tcPr>
-            <w:tcW w:type="dxa" w:w="2160"/>
-          </w:tcPr>
-          <w:p>
-            <w:r>
-              <w:t>0</w:t>
-            </w:r>
-          </w:p>
-        </w:tc>
-        <w:tc>
-          <w:tcPr>
-            <w:tcW w:type="dxa" w:w="2160"/>
-          </w:tcPr>
-          <w:p>
-            <w:r>
-              <w:t>USER 起始地址 0</w:t>
-            </w:r>
-          </w:p>
-        </w:tc>
-      </w:tr>
-      <w:tr>
-        <w:tc>
-          <w:tcPr>
-            <w:tcW w:type="dxa" w:w="2160"/>
-          </w:tcPr>
-          <w:p>
-            <w:r>
-              <w:t>②</w:t>
-            </w:r>
-          </w:p>
-        </w:tc>
-        <w:tc>
-          <w:tcPr>
-            <w:tcW w:type="dxa" w:w="2160"/>
-          </w:tcPr>
-          <w:p>
-            <w:r>
-              <w:t>WORDS</w:t>
-            </w:r>
-          </w:p>
-        </w:tc>
-        <w:tc>
-          <w:tcPr>
-            <w:tcW w:type="dxa" w:w="2160"/>
-          </w:tcPr>
-          <w:p>
-            <w:r>
-              <w:t>8</w:t>
-            </w:r>
-          </w:p>
-        </w:tc>
-        <w:tc>
-          <w:tcPr>
-            <w:tcW w:type="dxa" w:w="2160"/>
-          </w:tcPr>
-          <w:p>
-            <w:r>
-              <w:t>每通道读 USER 8 字</w:t>
-            </w:r>
-          </w:p>
-        </w:tc>
-      </w:tr>
-      <w:tr>
-        <w:tc>
-          <w:tcPr>
-            <w:tcW w:type="dxa" w:w="2160"/>
-          </w:tcPr>
-          <w:p>
-            <w:r>
-              <w:t>③</w:t>
-            </w:r>
-          </w:p>
-        </w:tc>
-        <w:tc>
-          <w:tcPr>
-            <w:tcW w:type="dxa" w:w="2160"/>
-          </w:tcPr>
-          <w:p>
-            <w:r>
-              <w:t>CMD</w:t>
-            </w:r>
-          </w:p>
-        </w:tc>
-        <w:tc>
-          <w:tcPr>
-            <w:tcW w:type="dxa" w:w="2160"/>
-          </w:tcPr>
-          <w:p>
-            <w:r>
-              <w:t>33</w:t>
-            </w:r>
-          </w:p>
-        </w:tc>
-        <w:tc>
-          <w:tcPr>
-            <w:tcW w:type="dxa" w:w="2160"/>
-          </w:tcPr>
-          <w:p>
-            <w:r>
-              <w:t>触发命令</w:t>
-            </w:r>
-          </w:p>
-        </w:tc>
-      </w:tr>
-      <w:tr>
-        <w:tc>
-          <w:tcPr>
-            <w:tcW w:type="dxa" w:w="2160"/>
-          </w:tcPr>
-          <w:p>
-            <w:r>
-              <w:t>④</w:t>
-            </w:r>
-          </w:p>
-        </w:tc>
-        <w:tc>
-          <w:tcPr>
-            <w:tcW w:type="dxa" w:w="2160"/>
-          </w:tcPr>
-          <w:p>
-            <w:r>
-              <w:t>等待</w:t>
-            </w:r>
-          </w:p>
-        </w:tc>
-        <w:tc>
-          <w:tcPr>
-            <w:tcW w:type="dxa" w:w="2160"/>
-          </w:tcPr>
-          <w:p>
-            <w:r>
-              <w:t>—</w:t>
-            </w:r>
-          </w:p>
-        </w:tc>
-        <w:tc>
-          <w:tcPr>
-            <w:tcW w:type="dxa" w:w="2160"/>
-          </w:tcPr>
-          <w:p>
-            <w:r>
-              <w:t>CMD_STATUS=2（约 300~600ms）</w:t>
-            </w:r>
-          </w:p>
-        </w:tc>
-      </w:tr>
-      <w:tr>
-        <w:tc>
-          <w:tcPr>
-            <w:tcW w:type="dxa" w:w="2160"/>
-          </w:tcPr>
-          <w:p>
-            <w:r>
-              <w:t>⑤</w:t>
-            </w:r>
-          </w:p>
-        </w:tc>
-        <w:tc>
-          <w:tcPr>
-            <w:tcW w:type="dxa" w:w="2160"/>
-          </w:tcPr>
-          <w:p>
-            <w:r>
-              <w:t>RETURN_DATA_LEN</w:t>
-            </w:r>
-          </w:p>
-        </w:tc>
-        <w:tc>
-          <w:tcPr>
-            <w:tcW w:type="dxa" w:w="2160"/>
-          </w:tcPr>
-          <w:p>
-            <w:r>
-              <w:t>108</w:t>
-            </w:r>
-          </w:p>
-        </w:tc>
-        <w:tc>
-          <w:tcPr>
-            <w:tcW w:type="dxa" w:w="2160"/>
-          </w:tcPr>
-          <w:p>
-            <w:r>
-              <w:t>3 通道 × 18 字 × 2 字节</w:t>
-            </w:r>
-          </w:p>
-        </w:tc>
-      </w:tr>
-      <w:tr>
-        <w:tc>
-          <w:tcPr>
-            <w:tcW w:type="dxa" w:w="2160"/>
-          </w:tcPr>
-          <w:p>
-            <w:r>
-              <w:t>⑤</w:t>
-            </w:r>
-          </w:p>
-        </w:tc>
-        <w:tc>
-          <w:tcPr>
-            <w:tcW w:type="dxa" w:w="2160"/>
-          </w:tcPr>
-          <w:p>
-            <w:r>
-              <w:t>RETURN_DATA1..54</w:t>
-            </w:r>
-          </w:p>
-        </w:tc>
-        <w:tc>
-          <w:tcPr>
-            <w:tcW w:type="dxa" w:w="2160"/>
-          </w:tcPr>
-          <w:p>
-            <w:r>
-              <w:t>—</w:t>
-            </w:r>
-          </w:p>
-        </w:tc>
-        <w:tc>
-          <w:tcPr>
-            <w:tcW w:type="dxa" w:w="2160"/>
-          </w:tcPr>
-          <w:p>
-            <w:r>
-              <w:t>三通道 EPC+USER 数据</w:t>
-            </w:r>
-          </w:p>
-        </w:tc>
-      </w:tr>
-      <w:tr>
-        <w:tc>
-          <w:tcPr>
-            <w:tcW w:type="dxa" w:w="2160"/>
-          </w:tcPr>
-          <w:p>
-            <w:r>
-              <w:t>⑥</w:t>
-            </w:r>
-          </w:p>
-        </w:tc>
-        <w:tc>
-          <w:tcPr>
-            <w:tcW w:type="dxa" w:w="2160"/>
-          </w:tcPr>
-          <w:p>
-            <w:r>
-              <w:t>CMD</w:t>
-            </w:r>
-          </w:p>
-        </w:tc>
-        <w:tc>
-          <w:tcPr>
-            <w:tcW w:type="dxa" w:w="2160"/>
-          </w:tcPr>
-          <w:p>
-            <w:r>
-              <w:t>0</w:t>
-            </w:r>
-          </w:p>
-        </w:tc>
-        <w:tc>
-          <w:tcPr>
-            <w:tcW w:type="dxa" w:w="2160"/>
-          </w:tcPr>
-          <w:p>
-            <w:r>
-              <w:t>复位命令</w:t>
-            </w:r>
-          </w:p>
-        </w:tc>
-      </w:tr>
-    </w:tbl>
-    <w:sectPr>
-      <w:pgSz w:w="12240" w:h="15840"/>
-      <w:pgMar w:top="1440" w:right="1800" w:bottom="1440" w:left="1800" w:header="720" w:footer="720" w:gutter="0"/>
-      <w:cols w:space="720" w:num="1"/>
-      <w:docGrid w:linePitch="360" w:charSpace="0"/>
-    </w:sectPr>
   </w:body>
 </w:document>
 </file>

</xml_diff>